<commit_message>
48fb72d9e86482ead7f0b4210987f4d7fa026822 deploy: siteground artifact
</commit_message>
<xml_diff>
--- a/hub/manuals/calendar-readonly.docx
+++ b/hub/manuals/calendar-readonly.docx
@@ -254,7 +254,7 @@
         <w:tc>
           <w:p>
             <w:r>
-              <w:t xml:space="preserve">Read its details, files and linked releases, and see every change made to it.</w:t>
+              <w:t xml:space="preserve">Read its details and linked releases, and see every change made to it.</w:t>
             </w:r>
           </w:p>
         </w:tc>
@@ -2679,32 +2679,6 @@
       </w:r>
       <w:r>
         <w:t xml:space="preserve">, you see the same updates.</w:t>
-      </w:r>
-    </w:p>
-    <w:p>
-      <w:pPr>
-        <w:pStyle w:val="Heading2"/>
-      </w:pPr>
-      <w:r>
-        <w:t xml:space="preserve">Files</w:t>
-      </w:r>
-    </w:p>
-    <w:p>
-      <w:pPr>
-        <w:spacing w:after="120"/>
-      </w:pPr>
-      <w:r>
-        <w:t xml:space="preserve">The </w:t>
-      </w:r>
-      <w:r>
-        <w:rPr>
-          <w:b/>
-          <w:bCs/>
-        </w:rPr>
-        <w:t xml:space="preserve">Records</w:t>
-      </w:r>
-      <w:r>
-        <w:t xml:space="preserve"> section appears only when it is turned on for your Calendar. It lists the activity's files, or "No files yet." Choose a file's name to open it. Only people who can see the activity can open its files.</w:t>
       </w:r>
     </w:p>
     <w:p>

</xml_diff>